<commit_message>
Deploying to gh-pages from @ jmgirard/hitop@0ffff789b1a000a20f9e72b71f35e1b83aa696e2 🚀
</commit_message>
<xml_diff>
--- a/downloads/hitopbr_A4.docx
+++ b/downloads/hitopbr_A4.docx
@@ -13209,7 +13209,7 @@
                 <w:szCs w:val="18"/>
                 <w:color w:val="000000"/>
               </w:rPr>
-              <w:t xml:space="preserve">8, 9, 18, 22, 23, 42, 44</w:t>
+              <w:t xml:space="preserve">8, 9, 18, 22, 23, 36, 42, 44</w:t>
             </w:r>
           </w:p>
         </w:tc>
@@ -13324,7 +13324,7 @@
                 <w:szCs w:val="18"/>
                 <w:color w:val="000000"/>
               </w:rPr>
-              <w:t xml:space="preserve">7, 12, 30, 31, 36, 37</w:t>
+              <w:t xml:space="preserve">7, 12, 30, 31, 37</w:t>
             </w:r>
           </w:p>
         </w:tc>
@@ -13935,7 +13935,7 @@
         <w:szCs w:val="16"/>
         <w:color w:val="BEBEBE"/>
       </w:rPr>
-      <w:t xml:space="preserve">Generated 2026-07-16 · hitop 0.2.0</w:t>
+      <w:t xml:space="preserve">Generated 2026-08-30 · hitop 0.2.0</w:t>
     </w:r>
     <w:r>
       <w:rPr>

</xml_diff>